<commit_message>
Add named study blocks and integrated Table 4.5d to DRC summary Section B
</commit_message>
<xml_diff>
--- a/DRC_Submission_Summary.docx
+++ b/DRC_Submission_Summary.docx
@@ -777,7 +777,345 @@
           <w:b w:val="0"/>
           <w:i w:val="0"/>
         </w:rPr>
-        <w:t>Blocks with negligible Malta area, or with no active marketing or aggregation activity, were excluded. This procedure ensures that the block frame is production-relevant, terrain-representative, and analytically complete for a stage-wise channel study. The specific blocks selected within each district are to be finalised by the candidate from the District Horticulture Office records and entered in Table 4.5a of the revised thesis.</w:t>
+        <w:t>Blocks with negligible Malta area, or with no active marketing or aggregation activity, were excluded. This procedure ensures that the block frame is production-relevant, terrain-representative, and analytically complete for a stage-wise channel study. The specific blocks selected are: in Pauri Garhwal, the Khirsu, Pauri, Kaljikhal, Thalisain, Lansdowne, and Kotdwar-belt blocks; in Tehri Garhwal, the Chamba, Ranichauri, Devprayag, Narendra Nagar, and Thauldhar blocks; in Chamoli, the Karnaprayag, Dasholi, Ghat, Gauchar, and Pokhari blocks; and in Rudraprayag, the Augustmuni, Ukhimath, Jakholi, and Rudraprayag blocks (Table 4.5a of the revised thesis).</w:t>
+      </w:r>
+    </w:p>
+    <w:p>
+      <w:r>
+        <w:rPr>
+          <w:b w:val="0"/>
+        </w:rPr>
+        <w:t>The comparative basis for selecting these districts and blocks is consolidated below. Each district was chosen to represent a distinct and necessary segment of the Garhwal Malta channel, as summarised in Table 4.5d (reproduced from Section 4.8.2 of the revised thesis).</w:t>
+      </w:r>
+    </w:p>
+    <w:p>
+      <w:r>
+        <w:rPr>
+          <w:b/>
+        </w:rPr>
+        <w:t>Table 4.5d Integrated selection rationale, production profiles, and marketing dynamics for the study sites</w:t>
+      </w:r>
+    </w:p>
+    <w:tbl>
+      <w:tblPr>
+        <w:tblStyle w:val="TableGrid"/>
+        <w:tblW w:type="auto" w:w="0"/>
+        <w:tblLook w:firstColumn="1" w:firstRow="1" w:lastColumn="0" w:lastRow="0" w:noHBand="0" w:noVBand="1" w:val="04A0"/>
+      </w:tblPr>
+      <w:tblGrid>
+        <w:gridCol w:w="1728"/>
+        <w:gridCol w:w="1728"/>
+        <w:gridCol w:w="1728"/>
+        <w:gridCol w:w="1728"/>
+        <w:gridCol w:w="1728"/>
+      </w:tblGrid>
+      <w:tr>
+        <w:tc>
+          <w:tcPr>
+            <w:tcW w:type="dxa" w:w="1728"/>
+          </w:tcPr>
+          <w:p>
+            <w:r/>
+            <w:r>
+              <w:rPr>
+                <w:b/>
+              </w:rPr>
+              <w:t>District</w:t>
+            </w:r>
+          </w:p>
+        </w:tc>
+        <w:tc>
+          <w:tcPr>
+            <w:tcW w:type="dxa" w:w="1728"/>
+          </w:tcPr>
+          <w:p>
+            <w:r/>
+            <w:r>
+              <w:rPr>
+                <w:b/>
+              </w:rPr>
+              <w:t>Agro-climatic &amp; topographic profile</w:t>
+            </w:r>
+          </w:p>
+        </w:tc>
+        <w:tc>
+          <w:tcPr>
+            <w:tcW w:type="dxa" w:w="1728"/>
+          </w:tcPr>
+          <w:p>
+            <w:r/>
+            <w:r>
+              <w:rPr>
+                <w:b/>
+              </w:rPr>
+              <w:t>Production volume &amp; harvest dynamics</w:t>
+            </w:r>
+          </w:p>
+        </w:tc>
+        <w:tc>
+          <w:tcPr>
+            <w:tcW w:type="dxa" w:w="1728"/>
+          </w:tcPr>
+          <w:p>
+            <w:r/>
+            <w:r>
+              <w:rPr>
+                <w:b/>
+              </w:rPr>
+              <w:t>Supply-chain &amp; marketing channel profile</w:t>
+            </w:r>
+          </w:p>
+        </w:tc>
+        <w:tc>
+          <w:tcPr>
+            <w:tcW w:type="dxa" w:w="1728"/>
+          </w:tcPr>
+          <w:p>
+            <w:r/>
+            <w:r>
+              <w:rPr>
+                <w:b/>
+              </w:rPr>
+              <w:t>Methodological &amp; analytical justification for selection</w:t>
+            </w:r>
+          </w:p>
+        </w:tc>
+      </w:tr>
+      <w:tr>
+        <w:tc>
+          <w:tcPr>
+            <w:tcW w:type="dxa" w:w="1728"/>
+          </w:tcPr>
+          <w:p>
+            <w:r/>
+            <w:r>
+              <w:t>Pauri Garhwal</w:t>
+            </w:r>
+          </w:p>
+        </w:tc>
+        <w:tc>
+          <w:tcPr>
+            <w:tcW w:type="dxa" w:w="1728"/>
+          </w:tcPr>
+          <w:p>
+            <w:r/>
+            <w:r>
+              <w:t>Elevation 900-1,800 m; sub-temperate climate with optimal chilling hours.</w:t>
+            </w:r>
+          </w:p>
+        </w:tc>
+        <w:tc>
+          <w:tcPr>
+            <w:tcW w:type="dxa" w:w="1728"/>
+          </w:tcPr>
+          <w:p>
+            <w:r/>
+            <w:r>
+              <w:t>Highest share (~35-40% cluster output); peak harvest Nov-Dec; high density of mature trees in scattered homegardens (Goswami et al., 2020).</w:t>
+            </w:r>
+          </w:p>
+        </w:tc>
+        <w:tc>
+          <w:tcPr>
+            <w:tcW w:type="dxa" w:w="1728"/>
+          </w:tcPr>
+          <w:p>
+            <w:r/>
+            <w:r>
+              <w:t>Dominance of pre-harvest contractor channels; primary transit via Kotdwar/Rishikesh mandis; post-harvest loss 20-30%.</w:t>
+            </w:r>
+          </w:p>
+        </w:tc>
+        <w:tc>
+          <w:tcPr>
+            <w:tcW w:type="dxa" w:w="1728"/>
+          </w:tcPr>
+          <w:p>
+            <w:r/>
+            <w:r>
+              <w:t>Officially designated One District One Product (ODOP) cluster for citrus under PMFME; establishes the commercial baseline for market-margin and volume comparisons.</w:t>
+            </w:r>
+          </w:p>
+        </w:tc>
+      </w:tr>
+      <w:tr>
+        <w:tc>
+          <w:tcPr>
+            <w:tcW w:type="dxa" w:w="1728"/>
+          </w:tcPr>
+          <w:p>
+            <w:r/>
+            <w:r>
+              <w:t>Tehri Garhwal</w:t>
+            </w:r>
+          </w:p>
+        </w:tc>
+        <w:tc>
+          <w:tcPr>
+            <w:tcW w:type="dxa" w:w="1728"/>
+          </w:tcPr>
+          <w:p>
+            <w:r/>
+            <w:r>
+              <w:t>Elevation 1,000-2,000 m; high sun exposure along river-valley terraces.</w:t>
+            </w:r>
+          </w:p>
+        </w:tc>
+        <w:tc>
+          <w:tcPr>
+            <w:tcW w:type="dxa" w:w="1728"/>
+          </w:tcPr>
+          <w:p>
+            <w:r/>
+            <w:r>
+              <w:t>Major share (~25-30% cluster output); peak harvest Nov-Jan; high TSS (total soluble solids) and sugar-acid balance.</w:t>
+            </w:r>
+          </w:p>
+        </w:tc>
+        <w:tc>
+          <w:tcPr>
+            <w:tcW w:type="dxa" w:w="1728"/>
+          </w:tcPr>
+          <w:p>
+            <w:r/>
+            <w:r>
+              <w:t>Major roadside direct-sales along the NH-34 corridor; pre-harvest contractor and commission-agent purchasing (Saxena &amp; Singh, 2015); post-harvest loss 15-25%.</w:t>
+            </w:r>
+          </w:p>
+        </w:tc>
+        <w:tc>
+          <w:tcPr>
+            <w:tcW w:type="dxa" w:w="1728"/>
+          </w:tcPr>
+          <w:p>
+            <w:r/>
+            <w:r>
+              <w:t>Captures highway aggregation-corridor dynamics; facilitates linkage with regional horticultural institutions (VCSG UUHF Ranichauri).</w:t>
+            </w:r>
+          </w:p>
+        </w:tc>
+      </w:tr>
+      <w:tr>
+        <w:tc>
+          <w:tcPr>
+            <w:tcW w:type="dxa" w:w="1728"/>
+          </w:tcPr>
+          <w:p>
+            <w:r/>
+            <w:r>
+              <w:t>Chamoli</w:t>
+            </w:r>
+          </w:p>
+        </w:tc>
+        <w:tc>
+          <w:tcPr>
+            <w:tcW w:type="dxa" w:w="1728"/>
+          </w:tcPr>
+          <w:p>
+            <w:r/>
+            <w:r>
+              <w:t>Elevation 1,400-2,200 m; high-altitude temperate transition zone.</w:t>
+            </w:r>
+          </w:p>
+        </w:tc>
+        <w:tc>
+          <w:tcPr>
+            <w:tcW w:type="dxa" w:w="1728"/>
+          </w:tcPr>
+          <w:p>
+            <w:r/>
+            <w:r>
+              <w:t>Moderate share (~15-20% cluster output); extended ripening window into January; high fruit shelf-life potential.</w:t>
+            </w:r>
+          </w:p>
+        </w:tc>
+        <w:tc>
+          <w:tcPr>
+            <w:tcW w:type="dxa" w:w="1728"/>
+          </w:tcPr>
+          <w:p>
+            <w:r/>
+            <w:r>
+              <w:t>High freight costs from long transit distances to plains markets; severe producer-price depreciation; post-harvest loss 25-35% (Goswami et al., 2020).</w:t>
+            </w:r>
+          </w:p>
+        </w:tc>
+        <w:tc>
+          <w:tcPr>
+            <w:tcW w:type="dxa" w:w="1728"/>
+          </w:tcPr>
+          <w:p>
+            <w:r/>
+            <w:r>
+              <w:t>Provides an extreme-case sample for remote, high-altitude terrain; evaluates severe logistical bottlenecks and farm-gate versus retail price-realisation gaps.</w:t>
+            </w:r>
+          </w:p>
+        </w:tc>
+      </w:tr>
+      <w:tr>
+        <w:tc>
+          <w:tcPr>
+            <w:tcW w:type="dxa" w:w="1728"/>
+          </w:tcPr>
+          <w:p>
+            <w:r/>
+            <w:r>
+              <w:t>Rudraprayag</w:t>
+            </w:r>
+          </w:p>
+        </w:tc>
+        <w:tc>
+          <w:tcPr>
+            <w:tcW w:type="dxa" w:w="1728"/>
+          </w:tcPr>
+          <w:p>
+            <w:r/>
+            <w:r>
+              <w:t>Elevation 1,000-1,900 m; steep slope geography along the Mandakini basin.</w:t>
+            </w:r>
+          </w:p>
+        </w:tc>
+        <w:tc>
+          <w:tcPr>
+            <w:tcW w:type="dxa" w:w="1728"/>
+          </w:tcPr>
+          <w:p>
+            <w:r/>
+            <w:r>
+              <w:t>Localised share (~10-15% cluster output); highly fragmented micro-holdings (&lt; 0.5 ha); harvest peak Nov-Dec.</w:t>
+            </w:r>
+          </w:p>
+        </w:tc>
+        <w:tc>
+          <w:tcPr>
+            <w:tcW w:type="dxa" w:w="1728"/>
+          </w:tcPr>
+          <w:p>
+            <w:r/>
+            <w:r>
+              <w:t>Limited local storage infrastructure; emerging reliance on Self-Help Groups (SHGs) and local processing units for squashes and ready-to-serve (RTS) beverages.</w:t>
+            </w:r>
+          </w:p>
+        </w:tc>
+        <w:tc>
+          <w:tcPr>
+            <w:tcW w:type="dxa" w:w="1728"/>
+          </w:tcPr>
+          <w:p>
+            <w:r/>
+            <w:r>
+              <w:t>Evaluates community-based value addition and SHG interventions; analyses alternatives to traditional contractor-dominated supply chains.</w:t>
+            </w:r>
+          </w:p>
+        </w:tc>
+      </w:tr>
+    </w:tbl>
+    <w:p>
+      <w:r>
+        <w:rPr>
+          <w:b w:val="0"/>
+        </w:rPr>
+        <w:t>Source: Author, compiled from field survey data, District Horticulture Office records, Goswami et al. (2020), and Saxena and Singh (2015).</w:t>
       </w:r>
     </w:p>
     <w:p>

</xml_diff>